<commit_message>
Week 1: paper, pilot script, metrics output
</commit_message>
<xml_diff>
--- a/docs/1.8 Predicting Bug Prone Functions in Student Code via Web Upload Analysis.docx
+++ b/docs/1.8 Predicting Bug Prone Functions in Student Code via Web Upload Analysis.docx
@@ -665,23 +665,7 @@
           <w:szCs w:val="20"/>
         </w:rPr>
         <w:noBreakHyphen/>
-        <w:t xml:space="preserve">level metrics can achieve moderate fault prediction accuracy in industrial settings. In contrast, the proposed work </w:t>
-      </w:r>
-      <w:r>
-        <w:rPr>
-          <w:rFonts w:ascii="Times New Roman" w:hAnsi="Times New Roman" w:cs="Times New Roman"/>
-          <w:sz w:val="20"/>
-          <w:szCs w:val="20"/>
-        </w:rPr>
-        <w:t>target’s</w:t>
-      </w:r>
-      <w:r>
-        <w:rPr>
-          <w:rFonts w:ascii="Times New Roman" w:hAnsi="Times New Roman" w:cs="Times New Roman"/>
-          <w:sz w:val="20"/>
-          <w:szCs w:val="20"/>
-        </w:rPr>
-        <w:t xml:space="preserve"> function</w:t>
+        <w:t>level metrics can achieve moderate fault prediction accuracy in industrial settings. In contrast, the proposed work target’s function</w:t>
       </w:r>
       <w:r>
         <w:rPr>
@@ -799,23 +783,7 @@
           <w:szCs w:val="20"/>
         </w:rPr>
         <w:noBreakHyphen/>
-        <w:t xml:space="preserve">project industrial datasets, and they show that ensemble methods handle metric multicollinearity and class imbalance more robustly than linear baselines. </w:t>
-      </w:r>
-      <w:r>
-        <w:rPr>
-          <w:rFonts w:ascii="Times New Roman" w:hAnsi="Times New Roman" w:cs="Times New Roman"/>
-          <w:sz w:val="20"/>
-          <w:szCs w:val="20"/>
-        </w:rPr>
-        <w:t>Changing</w:t>
-      </w:r>
-      <w:r>
-        <w:rPr>
-          <w:rFonts w:ascii="Times New Roman" w:hAnsi="Times New Roman" w:cs="Times New Roman"/>
-          <w:sz w:val="20"/>
-          <w:szCs w:val="20"/>
-        </w:rPr>
-        <w:t xml:space="preserve"> metrics such as churn and commit frequency further improve performance by capturing how code evolves over time, and industrial deployments at companies like Microsoft and Google demonstrate that such models can </w:t>
+        <w:t xml:space="preserve">project industrial datasets, and they show that ensemble methods handle metric multicollinearity and class imbalance more robustly than linear baselines. Changing metrics such as churn and commit frequency further improve performance by capturing how code evolves over time, and industrial deployments at companies like Microsoft and Google demonstrate that such models can </w:t>
       </w:r>
       <w:r>
         <w:rPr>
@@ -1977,23 +1945,7 @@
           <w:szCs w:val="20"/>
         </w:rPr>
         <w:noBreakHyphen/>
-        <w:t xml:space="preserve">prone. Where available, test failures and reruns will be used as additional signals, similar in spirit to how Tsabari et al. use error snapshots to reason </w:t>
-      </w:r>
-      <w:r>
-        <w:rPr>
-          <w:rFonts w:ascii="Times New Roman" w:hAnsi="Times New Roman" w:cs="Times New Roman"/>
-          <w:sz w:val="20"/>
-          <w:szCs w:val="20"/>
-        </w:rPr>
-        <w:t>for</w:t>
-      </w:r>
-      <w:r>
-        <w:rPr>
-          <w:rFonts w:ascii="Times New Roman" w:hAnsi="Times New Roman" w:cs="Times New Roman"/>
-          <w:sz w:val="20"/>
-          <w:szCs w:val="20"/>
-        </w:rPr>
-        <w:t xml:space="preserve"> student struggle.</w:t>
+        <w:t>prone. Where available, test failures and reruns will be used as additional signals, similar in spirit to how Tsabari et al. use error snapshots to reason for student struggle.</w:t>
       </w:r>
     </w:p>
     <w:p>
@@ -2416,23 +2368,7 @@
           <w:szCs w:val="20"/>
         </w:rPr>
         <w:noBreakHyphen/>
-        <w:t xml:space="preserve">prone </w:t>
-      </w:r>
-      <w:r>
-        <w:rPr>
-          <w:rFonts w:ascii="Times New Roman" w:hAnsi="Times New Roman" w:cs="Times New Roman"/>
-          <w:sz w:val="20"/>
-          <w:szCs w:val="20"/>
-        </w:rPr>
-        <w:t>correspond</w:t>
-      </w:r>
-      <w:r>
-        <w:rPr>
-          <w:rFonts w:ascii="Times New Roman" w:hAnsi="Times New Roman" w:cs="Times New Roman"/>
-          <w:sz w:val="20"/>
-          <w:szCs w:val="20"/>
-        </w:rPr>
-        <w:t xml:space="preserve"> to bug</w:t>
+        <w:t>prone correspond to bug</w:t>
       </w:r>
       <w:r>
         <w:rPr>
@@ -2697,17 +2633,7 @@
           <w:sz w:val="20"/>
           <w:szCs w:val="20"/>
         </w:rPr>
-        <w:t xml:space="preserve">E. </w:t>
-      </w:r>
-      <w:r>
-        <w:rPr>
-          <w:rFonts w:ascii="Times New Roman" w:hAnsi="Times New Roman" w:cs="Times New Roman"/>
-          <w:b/>
-          <w:bCs/>
-          <w:sz w:val="20"/>
-          <w:szCs w:val="20"/>
-        </w:rPr>
-        <w:t xml:space="preserve">Project Milestones (Weeks 1–4) </w:t>
+        <w:t xml:space="preserve">E. Project Milestones (Weeks 1–4) </w:t>
       </w:r>
     </w:p>
     <w:p>
@@ -2834,23 +2760,7 @@
           <w:sz w:val="20"/>
           <w:szCs w:val="20"/>
         </w:rPr>
-        <w:t>curves, feature importance</w:t>
-      </w:r>
-      <w:r>
-        <w:rPr>
-          <w:rFonts w:ascii="Times New Roman" w:hAnsi="Times New Roman" w:cs="Times New Roman"/>
-          <w:sz w:val="20"/>
-          <w:szCs w:val="20"/>
-        </w:rPr>
-        <w:t>) and</w:t>
-      </w:r>
-      <w:r>
-        <w:rPr>
-          <w:rFonts w:ascii="Times New Roman" w:hAnsi="Times New Roman" w:cs="Times New Roman"/>
-          <w:sz w:val="20"/>
-          <w:szCs w:val="20"/>
-        </w:rPr>
-        <w:t xml:space="preserve"> analyze which metrics contribute most to prediction performance.</w:t>
+        <w:t>curves, feature importance) and analyze which metrics contribute most to prediction performance.</w:t>
       </w:r>
     </w:p>
     <w:p>
@@ -2895,23 +2805,7 @@
           <w:szCs w:val="20"/>
         </w:rPr>
         <w:noBreakHyphen/>
-        <w:t xml:space="preserve">study evaluation (e.g., on one course or instructor), and prepare </w:t>
-      </w:r>
-      <w:r>
-        <w:rPr>
-          <w:rFonts w:ascii="Times New Roman" w:hAnsi="Times New Roman" w:cs="Times New Roman"/>
-          <w:sz w:val="20"/>
-          <w:szCs w:val="20"/>
-        </w:rPr>
-        <w:t>results</w:t>
-      </w:r>
-      <w:r>
-        <w:rPr>
-          <w:rFonts w:ascii="Times New Roman" w:hAnsi="Times New Roman" w:cs="Times New Roman"/>
-          <w:sz w:val="20"/>
-          <w:szCs w:val="20"/>
-        </w:rPr>
-        <w:t xml:space="preserve"> and discussion to validate or invalidate the original hypotheses.</w:t>
+        <w:t>study evaluation (e.g., on one course or instructor), and prepare results and discussion to validate or invalidate the original hypotheses.</w:t>
       </w:r>
     </w:p>
     <w:p>
@@ -5823,6 +5717,7 @@
   <w:style w:type="character" w:default="1" w:styleId="DefaultParagraphFont">
     <w:name w:val="Default Paragraph Font"/>
     <w:uiPriority w:val="1"/>
+    <w:semiHidden/>
     <w:unhideWhenUsed/>
   </w:style>
   <w:style w:type="table" w:default="1" w:styleId="TableNormal">

</xml_diff>